<commit_message>
Report: correct narrative to cold-started transient
Align the report with the committed case and the fixed Allrun: the run is a
transient buoyantPimpleFoam solve cold-started from a uniform 20 C still-air
field, not a steady buoyantSimpleFoam initialisation followed by a transient.
Updates the subtitle, the solver line, and the numerics section (with a note
that a steady init is a natural future refinement).

Co-Authored-By: Claude Opus 4.8 <noreply@anthropic.com>
Claude-Session: https://claude.ai/code/session_01TowAJRVws36puXuuMCcbwe
</commit_message>
<xml_diff>
--- a/HVAC_CFD_ceiling_cassette_room_report.docx
+++ b/HVAC_CFD_ceiling_cassette_room_report.docx
@@ -31,7 +31,7 @@
           <w:sz w:val="22"/>
           <w:szCs w:val="22"/>
         </w:rPr>
-        <w:t xml:space="preserve">Steady and transient conjugate-free simulation of a sloped-roof occupied space in OpenFOAM</w:t>
+        <w:t xml:space="preserve">Transient conjugate-free simulation of a sloped-roof occupied space in OpenFOAM</w:t>
       </w:r>
     </w:p>
     <w:p>
@@ -69,7 +69,7 @@
           <w:sz w:val="21"/>
           <w:szCs w:val="21"/>
         </w:rPr>
-        <w:t xml:space="preserve">buoyantSimpleFoam (steady) → buoyantPimpleFoam (transient)   </w:t>
+        <w:t xml:space="preserve">buoyantPimpleFoam (transient, cold-started)   </w:t>
       </w:r>
       <w:r>
         <w:rPr>
@@ -1687,7 +1687,7 @@
           <w:sz w:val="21"/>
           <w:szCs w:val="21"/>
         </w:rPr>
-        <w:t xml:space="preserve">The steady solution was obtained with buoyantSimpleFoam and used to initialise a transient buoyantPimpleFoam run (PIMPLE, 2 outer / 2 inner correctors, one non-orthogonal correction), with an adjustable time step capped at Courant number 2. Convection used bounded Gauss upwind for stability on the internal shear layers; Laplacian terms used corrected (non-orthogonality-aware) schemes, with wall distance computed by the meshWave method. Linear solvers were GAMG for p_rgh and PBiCGStab for the remaining fields.</w:t>
+        <w:t xml:space="preserve">The case is run as a transient buoyantPimpleFoam solve (PIMPLE, 2 outer / 2 inner correctors, one non-orthogonal correction), cold-started from a uniform 20 °C, still-air field, with an adjustable time step capped at Courant number 2. Convection used bounded Gauss upwind for stability on the internal shear layers; Laplacian terms used corrected (non-orthogonality-aware) schemes, with wall distance computed by the meshWave method. Linear solvers were GAMG for p_rgh and PBiCGStab for the remaining fields. (A steady buoyantSimpleFoam initialisation is a natural refinement but was not used here; the results below are therefore an early, developing transient — see §6.3.)</w:t>
       </w:r>
     </w:p>
     <w:p>

</xml_diff>